<commit_message>
cambnios subir de plan
</commit_message>
<xml_diff>
--- a/docs/sociedad/Estatutos_Trabflow_Technologies_SL.docx
+++ b/docs/sociedad/Estatutos_Trabflow_Technologies_SL.docx
@@ -592,6 +592,25 @@
       </w:pPr>
       <w:r>
         <w:rPr/>
+      </w:r>
+    </w:p>
+    <w:p>
+      <w:pPr>
+        <w:pStyle w:val="Normal"/>
+        <w:rPr/>
+      </w:pPr>
+      <w:r>
+        <w:rPr/>
+      </w:r>
+    </w:p>
+    <w:p>
+      <w:pPr>
+        <w:pStyle w:val="Normal"/>
+        <w:rPr/>
+      </w:pPr>
+      <w:r>
+        <w:rPr/>
+        <w:t>whsec_lGKAtBJ3qpMGAICwfkvP3Wyatreiie6i</w:t>
       </w:r>
       <w:r>
         <w:br w:type="page"/>
@@ -2601,7 +2620,7 @@
     </w:r>
     <w:r>
       <w:rPr/>
-      <w:t>12</w:t>
+      <w:t>3</w:t>
     </w:r>
     <w:r>
       <w:rPr/>

</xml_diff>